<commit_message>
Review-driven refinements: EO62 legal precision, claim softening, homepage merge, contact + 988, a11y fixes, doc rebuilds
</commit_message>
<xml_diff>
--- a/data-center-deals/files/model-data-center-host-community-term-sheet.docx
+++ b/data-center-deals/files/model-data-center-host-community-term-sheet.docx
@@ -28,7 +28,7 @@
     </w:p>
     <w:p>
       <w:r>
-        <w:t xml:space="preserve">Before negotiating with any developer, publish your starting terms. Every applicant sees the same sheet. The question should not be "what incentive must we offer to land this project" but "what is the maximum economic rent the community can capture without losing the project." Where sites, grid capacity, or water are scarce and multiple developers are interested, invite competing offers </w:t>
+        <w:t xml:space="preserve">Before negotiating with any developer, publish your starting terms. Every applicant sees the same sheet. The question should not be "what incentive must we offer to land this project" but "what level of public value the community can reasonably secure while maintaining a competitive project." Where sites, grid capacity, or water are scarce and multiple developers are interested, invite competing offers </w:t>
       </w:r>
       <w:r>
         <w:rPr>
@@ -98,7 +98,7 @@
         <w:t>3. Annual community-benefit payments, separate from taxes, indexed to scale.</w:t>
       </w:r>
       <w:r>
-        <w:t xml:space="preserve"> Payments must recur yearly, rise with inflation, and ratchet upward with metered MW demand if the facility expands. Keep three measures separate: (1) upfront or lifetime community investment, for which New York's framework recommends at least $1 million per MW of utility demand; (2) recurring annual tax or PILOT revenue, where West Feliciana Parish projects roughly $273,000 per MW of contracted utility demand per year through its PILOT/lease structure; (3) recurring community payments above and beyond taxes, a separate category. Do not compare a one-time per-MW investment figure with an annual per-MW revenue figure; they measure different things. The upstate New York proposal implies roughly $19,000 per MW per year in recurring value. Where a community lands in that range depends on whether its terms were published before the developer arrived. Every expansion of contracted MW must automatically reopen the economics: additional community investment, additional annual payments, water and sewer reassessment, grid-cost reassessment, increased decommissioning security, and fresh environmental and noise review.</w:t>
+        <w:t xml:space="preserve"> Payments must recur yearly, rise with inflation, and ratchet upward with metered MW demand if the facility expands. Keep three measures separate: (1) upfront or lifetime community investment, for which New York's framework recommends at least $1 million per MW of utility demand; (2) recurring annual tax or PILOT revenue, where West Feliciana Parish projects roughly $273,000 per MW of contracted utility demand per year through its PILOT/lease structure; (3) recurring community payments above and beyond taxes, a separate category. Do not compare a one-time per-MW investment figure with an annual per-MW revenue figure; they measure different things. The upstate New York proposal implies roughly $19,000 per MW per year in recurring value. These examples illustrate how widely deal economics can vary and why communities should establish benchmarks before project-specific negotiations begin. Every expansion of contracted MW must automatically reopen the economics: additional community investment, additional annual payments, water and sewer reassessment, grid-cost reassessment, increased decommissioning security, and fresh environmental and noise review.</w:t>
       </w:r>
     </w:p>
     <w:p>

</xml_diff>